<commit_message>
assets: add fabia images and updated terms doc
</commit_message>
<xml_diff>
--- a/public/doc/terms.docx
+++ b/public/doc/terms.docx
@@ -436,7 +436,13 @@
         </w:numPr>
       </w:pPr>
       <w:r>
-        <w:t xml:space="preserve">Cena prodávaného zboží včetně ceny  </w:t>
+        <w:t>Cena prodávaného zboží</w:t>
+      </w:r>
+      <w:r>
+        <w:t>,</w:t>
+      </w:r>
+      <w:r>
+        <w:t xml:space="preserve"> včetně ceny </w:t>
       </w:r>
       <w:r>
         <w:t>z</w:t>
@@ -485,6 +491,12 @@
       <w:r>
         <w:t>bankovním převodem na základě platebních údajů uvedených na faktuře.</w:t>
       </w:r>
+      <w:r>
+        <w:t xml:space="preserve"> Odeslaná objednávka je pro kupujícího závazná. Po odeslání objednávky obdrží kupující potvrzující email s rekapitulací objednaného zboží a služeb</w:t>
+      </w:r>
+      <w:r>
+        <w:t xml:space="preserve"> a zálohovou fakturu. Jejím uhrazením vzniká prodávajícímu povinnost dodat objednané zboží. Vlastnické právo přechází na kupujícího až úplným zaplacením kupní ceny.</w:t>
+      </w:r>
     </w:p>
     <w:p>
       <w:pPr>
@@ -544,11 +556,8 @@
         </w:numPr>
       </w:pPr>
       <w:r>
-        <w:t xml:space="preserve">Pokud mezi prodávajícím a spotřebitelem dojde ke spotřebitelskému sporu, má spotřebitel právo na jeho mimosoudní řešení. Subjektem mimosoudního řešení podle zákona č. 634/1992 Sb., o ochraně spotřebitele, je Česká obchodní inspekce, Ústřední inspektorát – oddělení ADR, Štěpánská 15, 120 00 Praha 2. Veškeré podrobnosti k mimosoudnímu řešení sporů jsou uvedeny na stránkách </w:t>
-      </w:r>
-      <w:r>
         <w:lastRenderedPageBreak/>
-        <w:t>České obchodní inspekce: www.coi.cz, www.adr.coi.cz, e-mail: adr@coi.cz. Spotřebitel může využít rovněž platformu pro řešení sporů on-line, která je zřízena Evropskou komisí na adrese http://ec.europa.eu/consumers/odr/.</w:t>
+        <w:t>Pokud mezi prodávajícím a spotřebitelem dojde ke spotřebitelskému sporu, má spotřebitel právo na jeho mimosoudní řešení. Subjektem mimosoudního řešení podle zákona č. 634/1992 Sb., o ochraně spotřebitele, je Česká obchodní inspekce, Ústřední inspektorát – oddělení ADR, Štěpánská 15, 120 00 Praha 2. Veškeré podrobnosti k mimosoudnímu řešení sporů jsou uvedeny na stránkách České obchodní inspekce: www.coi.cz, www.adr.coi.cz, e-mail: adr@coi.cz. Spotřebitel může využít rovněž platformu pro řešení sporů on-line, která je zřízena Evropskou komisí na adrese http://ec.europa.eu/consumers/odr/.</w:t>
       </w:r>
     </w:p>
     <w:p>
@@ -705,7 +714,11 @@
         <w:t>Dokončit objednávku zavazující k platbě</w:t>
       </w:r>
       <w:r>
-        <w:t>“. Údaje uvedené v objednávce jsou prodávajícím považovány za správné. Prodávající neprodleně po obdržení objednávky toto obdržení kupujícímu potvrdí elektronickou poštou, a to na adresu elektronické pošty kupujícího uvedenou v uživatelském účtu či v objednávce (dále také jen </w:t>
+        <w:t xml:space="preserve">“. Údaje uvedené v objednávce jsou prodávajícím považovány za správné. Prodávající neprodleně po obdržení objednávky toto obdržení kupujícímu potvrdí elektronickou poštou, a to na adresu elektronické </w:t>
+      </w:r>
+      <w:r>
+        <w:lastRenderedPageBreak/>
+        <w:t>pošty kupujícího uvedenou v uživatelském účtu či v objednávce (dále také jen </w:t>
       </w:r>
       <w:r>
         <w:rPr>
@@ -753,7 +766,6 @@
         </w:numPr>
       </w:pPr>
       <w:r>
-        <w:lastRenderedPageBreak/>
         <w:t>Kupní smlouva mezi prodávajícím a kupujícím je v případě objednání zboží prostřednictvím webové stránky uzavřena až doručením přijetí objednávky (akceptací), jež je prodávajícím zasláno kupujícímu elektronickou poštou, a to na elektronickou adresu kupujícího.</w:t>
       </w:r>
     </w:p>
@@ -885,6 +897,7 @@
         </w:numPr>
       </w:pPr>
       <w:r>
+        <w:lastRenderedPageBreak/>
         <w:t>poslední kus zboží, objedná-li spotřebitel v rámci jedné objednávky více kusů zboží, které jsou dodávány samostatně,</w:t>
       </w:r>
     </w:p>
@@ -918,90 +931,90 @@
         </w:numPr>
       </w:pPr>
       <w:r>
+        <w:t>K odstoupení může spotřebitel využít vzorový formulář, který je zveřejněn na webové stránce, anebo odstoupit jakoukoli jinou formou tak, aby bylo zřejmé, od jaké kupní smlouvy spotřebitel odstupuje a jakého zboží se odstoupení týká.</w:t>
+      </w:r>
+    </w:p>
+    <w:p>
+      <w:pPr>
+        <w:numPr>
+          <w:ilvl w:val="0"/>
+          <w:numId w:val="10"/>
+        </w:numPr>
+      </w:pPr>
+      <w:r>
+        <w:t>Spotřebitel je povinen své odstoupení od kupní smlouvy odeslat ve lhůtě 14 dnů dle čl. 6.1. těchto obchodních podmínek, a to na e-mailovou adresu info@nejlevnejsi-skoda.cz. V případě použití formuláře pro odstoupení prodávající spotřebiteli bez zbytečného odkladu potvrdí jeho přijetí.</w:t>
+      </w:r>
+    </w:p>
+    <w:p>
+      <w:pPr>
+        <w:numPr>
+          <w:ilvl w:val="0"/>
+          <w:numId w:val="10"/>
+        </w:numPr>
+      </w:pPr>
+      <w:r>
+        <w:t>Spotřebitel pro urychlení vyřízení věci k odstoupení přiloží kopii dokladu o platbě, fakturu nebo jiný doklad či důkaz k prokázání, že se jedná o zboží zakoupené u prodávajícího. Samotné nepředložení těchto dokladů ovšem nebrání vyřízení odstoupení od kupní smlouvy. Spotřebitel k odstoupení připojí i informaci o volbě způsobu vrácení peněz, pokud je nechce vrátit stejným způsobem, jakým cenu hradil.</w:t>
+      </w:r>
+    </w:p>
+    <w:p>
+      <w:pPr>
+        <w:numPr>
+          <w:ilvl w:val="0"/>
+          <w:numId w:val="10"/>
+        </w:numPr>
+      </w:pPr>
+      <w:r>
+        <w:t>Náklady spojené s vrácením zboží nese v případě odstoupení od kupní smlouvy spotřebitel. Jde-li o smlouvu uzavřenou distančním způsobem, činí náklady pro spotřebitele spojené s vrácením zboží, který nelze vrátit pro svou povahu obvyklou cestou, částku maximálně ve výši 20.000,- Kč vč. DPH.</w:t>
+      </w:r>
+    </w:p>
+    <w:p>
+      <w:pPr>
+        <w:numPr>
+          <w:ilvl w:val="0"/>
+          <w:numId w:val="10"/>
+        </w:numPr>
+      </w:pPr>
+      <w:r>
+        <w:t>Jestliže spotřebitel zvolil jiný než nejlevnější způsob dodání zboží, který prodávající nabízí, vrátí prodávající spotřebiteli náklady na dodání zboží ve výši odpovídající nejlevnějšímu nabízenému způsobu dodání zboží.</w:t>
+      </w:r>
+    </w:p>
+    <w:p>
+      <w:pPr>
+        <w:numPr>
+          <w:ilvl w:val="0"/>
+          <w:numId w:val="10"/>
+        </w:numPr>
+      </w:pPr>
+      <w:r>
+        <w:t>Nejpozději do 14 dnů od odstoupení od kupní smlouvy prodávající vrátí spotřebiteli peníze, které od spotřebitele přijal jako platbu za zboží. Peníze prodávající vrátí stejným způsobem, jakým je obdržel, leda by spotřebitel souhlasil s jiným způsobem platby, se kterým by pro něho nebyly spojeny další náklady. Prodávající není povinen vrátit spotřebiteli peněžní prostředky dříve, než spotřebitel vrátí prodávajícímu zboží nebo než prokáže, že zboží odeslal prodávajícímu, podle toho, co nastane dříve.</w:t>
+      </w:r>
+    </w:p>
+    <w:p>
+      <w:pPr>
+        <w:numPr>
+          <w:ilvl w:val="0"/>
+          <w:numId w:val="10"/>
+        </w:numPr>
+      </w:pPr>
+      <w:r>
+        <w:t xml:space="preserve">Spotřebitel je povinen zboží bez zbytečného odkladu po odstoupení od kupní smlouvy, nejpozději do 14 dnů, </w:t>
+      </w:r>
+      <w:r>
+        <w:t xml:space="preserve">vrátit zboží </w:t>
+      </w:r>
+      <w:r>
+        <w:t xml:space="preserve">osobně. </w:t>
+      </w:r>
+    </w:p>
+    <w:p>
+      <w:pPr>
+        <w:numPr>
+          <w:ilvl w:val="0"/>
+          <w:numId w:val="10"/>
+        </w:numPr>
+      </w:pPr>
+      <w:r>
         <w:lastRenderedPageBreak/>
-        <w:t>K odstoupení může spotřebitel využít vzorový formulář, který je zveřejněn na webové stránce, anebo odstoupit jakoukoli jinou formou tak, aby bylo zřejmé, od jaké kupní smlouvy spotřebitel odstupuje a jakého zboží se odstoupení týká.</w:t>
-      </w:r>
-    </w:p>
-    <w:p>
-      <w:pPr>
-        <w:numPr>
-          <w:ilvl w:val="0"/>
-          <w:numId w:val="10"/>
-        </w:numPr>
-      </w:pPr>
-      <w:r>
-        <w:t>Spotřebitel je povinen své odstoupení od kupní smlouvy odeslat ve lhůtě 14 dnů dle čl. 6.1. těchto obchodních podmínek, a to na e-mailovou adresu info@nejlevnejsi-skoda.cz. V případě použití formuláře pro odstoupení prodávající spotřebiteli bez zbytečného odkladu potvrdí jeho přijetí.</w:t>
-      </w:r>
-    </w:p>
-    <w:p>
-      <w:pPr>
-        <w:numPr>
-          <w:ilvl w:val="0"/>
-          <w:numId w:val="10"/>
-        </w:numPr>
-      </w:pPr>
-      <w:r>
-        <w:t>Spotřebitel pro urychlení vyřízení věci k odstoupení přiloží kopii dokladu o platbě, fakturu nebo jiný doklad či důkaz k prokázání, že se jedná o zboží zakoupené u prodávajícího. Samotné nepředložení těchto dokladů ovšem nebrání vyřízení odstoupení od kupní smlouvy. Spotřebitel k odstoupení připojí i informaci o volbě způsobu vrácení peněz, pokud je nechce vrátit stejným způsobem, jakým cenu hradil.</w:t>
-      </w:r>
-    </w:p>
-    <w:p>
-      <w:pPr>
-        <w:numPr>
-          <w:ilvl w:val="0"/>
-          <w:numId w:val="10"/>
-        </w:numPr>
-      </w:pPr>
-      <w:r>
-        <w:t>Náklady spojené s vrácením zboží nese v případě odstoupení od kupní smlouvy spotřebitel. Jde-li o smlouvu uzavřenou distančním způsobem, činí náklady pro spotřebitele spojené s vrácením zboží, který nelze vrátit pro svou povahu obvyklou cestou, částku maximálně ve výši 20.000,- Kč vč. DPH.</w:t>
-      </w:r>
-    </w:p>
-    <w:p>
-      <w:pPr>
-        <w:numPr>
-          <w:ilvl w:val="0"/>
-          <w:numId w:val="10"/>
-        </w:numPr>
-      </w:pPr>
-      <w:r>
-        <w:t>Jestliže spotřebitel zvolil jiný než nejlevnější způsob dodání zboží, který prodávající nabízí, vrátí prodávající spotřebiteli náklady na dodání zboží ve výši odpovídající nejlevnějšímu nabízenému způsobu dodání zboží.</w:t>
-      </w:r>
-    </w:p>
-    <w:p>
-      <w:pPr>
-        <w:numPr>
-          <w:ilvl w:val="0"/>
-          <w:numId w:val="10"/>
-        </w:numPr>
-      </w:pPr>
-      <w:r>
-        <w:t>Nejpozději do 14 dnů od odstoupení od kupní smlouvy prodávající vrátí spotřebiteli peníze, které od spotřebitele přijal jako platbu za zboží. Peníze prodávající vrátí stejným způsobem, jakým je obdržel, leda by spotřebitel souhlasil s jiným způsobem platby, se kterým by pro něho nebyly spojeny další náklady. Prodávající není povinen vrátit spotřebiteli peněžní prostředky dříve, než spotřebitel vrátí prodávajícímu zboží nebo než prokáže, že zboží odeslal prodávajícímu, podle toho, co nastane dříve.</w:t>
-      </w:r>
-    </w:p>
-    <w:p>
-      <w:pPr>
-        <w:numPr>
-          <w:ilvl w:val="0"/>
-          <w:numId w:val="10"/>
-        </w:numPr>
-      </w:pPr>
-      <w:r>
-        <w:t xml:space="preserve">Spotřebitel je povinen zboží bez zbytečného odkladu po odstoupení od kupní smlouvy, nejpozději do 14 dnů, </w:t>
-      </w:r>
-      <w:r>
-        <w:t xml:space="preserve">vrátit zboží </w:t>
-      </w:r>
-      <w:r>
-        <w:t xml:space="preserve">osobně. </w:t>
-      </w:r>
-    </w:p>
-    <w:p>
-      <w:pPr>
-        <w:numPr>
-          <w:ilvl w:val="0"/>
-          <w:numId w:val="10"/>
-        </w:numPr>
-      </w:pPr>
-      <w:r>
         <w:t>Spotřebitel odpovídá v případě odstoupení od smlouvy bez udání důvodu pouze za snížení hodnoty zboží, které vzniklo v důsledku nakládání s tímto zbožím jinak, než je nutné k tomu, aby se seznámil s povahou, vlastnostmi a funkčností zboží.</w:t>
       </w:r>
     </w:p>
@@ -1035,7 +1048,6 @@
         </w:numPr>
       </w:pPr>
       <w:r>
-        <w:lastRenderedPageBreak/>
         <w:t>dodávky zboží, které podléhá rychlé zkáze, nebo zboží s krátkou dobou spotřeby, jakož i zboží, které bylo po dodání nenávratně smíseno s jiným zbožím,</w:t>
       </w:r>
     </w:p>
@@ -1140,6 +1152,7 @@
         </w:numPr>
       </w:pPr>
       <w:r>
+        <w:lastRenderedPageBreak/>
         <w:t>V případě, že je z důvodů na straně kupujícího nutno zboží doručovat opakovaně nebo jiným způsobem, než bylo uvedeno v objednávce, je kupující povinen uhradit náklady spojené s opakovaným doručováním zboží, resp. náklady spojené s jiným způsobem doručení.</w:t>
       </w:r>
     </w:p>
@@ -1178,7 +1191,6 @@
         </w:numPr>
       </w:pPr>
       <w:r>
-        <w:lastRenderedPageBreak/>
         <w:t>Prodávající odpovídá spotřebiteli, že zboží při převzetí nemá vady. Zejména prodávající odpovídá spotřebiteli, že v době, kdy spotřebitel zboží převzal, zboží:</w:t>
       </w:r>
     </w:p>
@@ -1305,6 +1317,7 @@
         </w:numPr>
       </w:pPr>
       <w:r>
+        <w:lastRenderedPageBreak/>
         <w:t>Kupující je oprávněn při vadném plnění požadovat dle povahy a závažnosti vady odstranění vady, výměnu zboží, přiměřenou slevu z kupní ceny nebo odstoupit od smlouvy.</w:t>
       </w:r>
     </w:p>
@@ -1335,7 +1348,6 @@
         </w:numPr>
       </w:pPr>
       <w:r>
-        <w:lastRenderedPageBreak/>
         <w:t>Prodávající je povinen spotřebiteli vydat při uplatnění reklamace písemné potvrzení, ve kterém uvede datum, kdy spotřebitel reklamaci uplatnil, co je jejím obsahem, jaký způsob vyřízení reklamace spotřebitel požaduje a kontaktní údaje spotřebitele pro účely poskytnutí informace o vyřízení reklamace.</w:t>
       </w:r>
     </w:p>
@@ -1462,6 +1474,7 @@
         </w:numPr>
       </w:pPr>
       <w:r>
+        <w:lastRenderedPageBreak/>
         <w:t>Prodávající je vedle dalších případů uvedených v těchto obchodních podmínkách oprávněn od kupní smlouvy odstoupit také v případě neposkytnutí součinnosti ze strany kupujícího a z dalších důvodů uvedených v právních předpisech.</w:t>
       </w:r>
     </w:p>
@@ -1473,115 +1486,115 @@
         </w:numPr>
       </w:pPr>
       <w:r>
-        <w:t xml:space="preserve">Kupující je povinen v případě, že dojde z jakéhokoliv důvodu k ukončení kupní smlouvy či z jakéhokoliv důvodu na straně kupujícího nedojde k uzavření kupní smlouvy, nahradit prodávajícímu veškeré náklady vzniklé v souvislosti s kupní </w:t>
+        <w:t>Kupující je povinen v případě, že dojde z jakéhokoliv důvodu k ukončení kupní smlouvy či z jakéhokoliv důvodu na straně kupujícího nedojde k uzavření kupní smlouvy, nahradit prodávajícímu veškeré náklady vzniklé v souvislosti s kupní smlouvou či jednáním o jejím uzavření, zejména náklady na úpravu či výrobu zboží dle pokynů a představ kupujícího, přípravu zboží k odeslání, náklady na demontáž a dopravu zboží, náklady na vrácení zboží prodávajícímu apod.</w:t>
+      </w:r>
+    </w:p>
+    <w:p>
+      <w:pPr>
+        <w:numPr>
+          <w:ilvl w:val="0"/>
+          <w:numId w:val="14"/>
+        </w:numPr>
+      </w:pPr>
+      <w:r>
+        <w:t>V případě výpadku informačního systému nebo zásahu vyšší moci (např. výpadek elektřiny atd.) prodávající neodpovídá za nedodržení provozní doby e-shopu.</w:t>
+      </w:r>
+    </w:p>
+    <w:p>
+      <w:pPr>
+        <w:numPr>
+          <w:ilvl w:val="0"/>
+          <w:numId w:val="14"/>
+        </w:numPr>
+      </w:pPr>
+      <w:r>
+        <w:t>Kupující tímto přebírá na sebe nebezpečí změny okolností ve smyslu § 1765 odst. 2 občanského zákoníku.</w:t>
+      </w:r>
+    </w:p>
+    <w:p>
+      <w:pPr>
+        <w:numPr>
+          <w:ilvl w:val="0"/>
+          <w:numId w:val="14"/>
+        </w:numPr>
+      </w:pPr>
+      <w:r>
+        <w:t>Kupující uzavřením kupní smlouvy souhlasí ve smyslu ustanovení § 7 odst. 2 zákona č. 480/2004 Sb., o některých službách informační společnosti a o změně některých zákonů (zákon o některých službách informační společnosti), ve znění pozdějších předpisů, se zasíláním obchodních sdělení prodávajícím na elektronickou adresu či na telefonní číslo kupujícího.</w:t>
+      </w:r>
+    </w:p>
+    <w:p>
+      <w:r>
+        <w:rPr>
+          <w:b/>
+          <w:bCs/>
+        </w:rPr>
+        <w:t>9</w:t>
+      </w:r>
+      <w:r>
+        <w:rPr>
+          <w:b/>
+          <w:bCs/>
+        </w:rPr>
+        <w:t>. ZÁVĚREČNÁ USTANOVENÍ</w:t>
+      </w:r>
+    </w:p>
+    <w:p>
+      <w:pPr>
+        <w:numPr>
+          <w:ilvl w:val="0"/>
+          <w:numId w:val="15"/>
+        </w:numPr>
+      </w:pPr>
+      <w:r>
+        <w:t>Pokud vztah založený kupní smlouvou obsahuje mezinárodní (zahraniční) prvek, pak se tento vztah se řídí českým právem.</w:t>
+      </w:r>
+    </w:p>
+    <w:p>
+      <w:pPr>
+        <w:numPr>
+          <w:ilvl w:val="0"/>
+          <w:numId w:val="15"/>
+        </w:numPr>
+      </w:pPr>
+      <w:r>
+        <w:t>Vztahy a případné spory, které vzniknou na základě kupní smlouvy, budou řešeny výhradně podle práva České republiky a budou řešeny příslušnými soudy České republiky. Úmluva OSN o smlouvách o mezinárodní koupi zboží (CISG) se v souladu s čl. 6 této úmluvy neuplatní.</w:t>
+      </w:r>
+    </w:p>
+    <w:p>
+      <w:pPr>
+        <w:numPr>
+          <w:ilvl w:val="0"/>
+          <w:numId w:val="15"/>
+        </w:numPr>
+      </w:pPr>
+      <w:r>
+        <w:t>Kupní smlouva je uzavírána v českém jazyce. Pokud vznikne pro potřebu kupujícího překlad textu smlouvy, platí, že v případě sporu o výklad pojmů platí výklad smlouvy v českém jazyce.</w:t>
+      </w:r>
+    </w:p>
+    <w:p>
+      <w:pPr>
+        <w:numPr>
+          <w:ilvl w:val="0"/>
+          <w:numId w:val="15"/>
+        </w:numPr>
+      </w:pPr>
+      <w:r>
+        <w:t>Uzavřená kupní smlouva je prodávajícím archivována v interním systému po dobu nejméně tří let od jejího uzavření, nejdéle však na dobu dle příslušných právních předpisů, za účelem jejího úspěšného splnění a není přístupná třetím nezúčastněným stranám. Kupujícímu poskytne prodávající přístup ke kupní smlouvě v odůvodněných případech.</w:t>
+      </w:r>
+    </w:p>
+    <w:p>
+      <w:pPr>
+        <w:numPr>
+          <w:ilvl w:val="0"/>
+          <w:numId w:val="15"/>
+        </w:numPr>
+      </w:pPr>
+      <w:r>
+        <w:t xml:space="preserve">Je-li některé ustanovení těchto obchodních podmínek neplatné nebo neúčinné, nebo se takovým stane, namísto neplatných ustanovení nastoupí ustanovení, </w:t>
       </w:r>
       <w:r>
         <w:lastRenderedPageBreak/>
-        <w:t>smlouvou či jednáním o jejím uzavření, zejména náklady na úpravu či výrobu zboží dle pokynů a představ kupujícího, přípravu zboží k odeslání, náklady na demontáž a dopravu zboží, náklady na vrácení zboží prodávajícímu apod.</w:t>
-      </w:r>
-    </w:p>
-    <w:p>
-      <w:pPr>
-        <w:numPr>
-          <w:ilvl w:val="0"/>
-          <w:numId w:val="14"/>
-        </w:numPr>
-      </w:pPr>
-      <w:r>
-        <w:t>V případě výpadku informačního systému nebo zásahu vyšší moci (např. výpadek elektřiny atd.) prodávající neodpovídá za nedodržení provozní doby e-shopu.</w:t>
-      </w:r>
-    </w:p>
-    <w:p>
-      <w:pPr>
-        <w:numPr>
-          <w:ilvl w:val="0"/>
-          <w:numId w:val="14"/>
-        </w:numPr>
-      </w:pPr>
-      <w:r>
-        <w:t>Kupující tímto přebírá na sebe nebezpečí změny okolností ve smyslu § 1765 odst. 2 občanského zákoníku.</w:t>
-      </w:r>
-    </w:p>
-    <w:p>
-      <w:pPr>
-        <w:numPr>
-          <w:ilvl w:val="0"/>
-          <w:numId w:val="14"/>
-        </w:numPr>
-      </w:pPr>
-      <w:r>
-        <w:t>Kupující uzavřením kupní smlouvy souhlasí ve smyslu ustanovení § 7 odst. 2 zákona č. 480/2004 Sb., o některých službách informační společnosti a o změně některých zákonů (zákon o některých službách informační společnosti), ve znění pozdějších předpisů, se zasíláním obchodních sdělení prodávajícím na elektronickou adresu či na telefonní číslo kupujícího.</w:t>
-      </w:r>
-    </w:p>
-    <w:p>
-      <w:r>
-        <w:rPr>
-          <w:b/>
-          <w:bCs/>
-        </w:rPr>
-        <w:t>9</w:t>
-      </w:r>
-      <w:r>
-        <w:rPr>
-          <w:b/>
-          <w:bCs/>
-        </w:rPr>
-        <w:t>. ZÁVĚREČNÁ USTANOVENÍ</w:t>
-      </w:r>
-    </w:p>
-    <w:p>
-      <w:pPr>
-        <w:numPr>
-          <w:ilvl w:val="0"/>
-          <w:numId w:val="15"/>
-        </w:numPr>
-      </w:pPr>
-      <w:r>
-        <w:t>Pokud vztah založený kupní smlouvou obsahuje mezinárodní (zahraniční) prvek, pak se tento vztah se řídí českým právem.</w:t>
-      </w:r>
-    </w:p>
-    <w:p>
-      <w:pPr>
-        <w:numPr>
-          <w:ilvl w:val="0"/>
-          <w:numId w:val="15"/>
-        </w:numPr>
-      </w:pPr>
-      <w:r>
-        <w:t>Vztahy a případné spory, které vzniknou na základě kupní smlouvy, budou řešeny výhradně podle práva České republiky a budou řešeny příslušnými soudy České republiky. Úmluva OSN o smlouvách o mezinárodní koupi zboží (CISG) se v souladu s čl. 6 této úmluvy neuplatní.</w:t>
-      </w:r>
-    </w:p>
-    <w:p>
-      <w:pPr>
-        <w:numPr>
-          <w:ilvl w:val="0"/>
-          <w:numId w:val="15"/>
-        </w:numPr>
-      </w:pPr>
-      <w:r>
-        <w:t>Kupní smlouva je uzavírána v českém jazyce. Pokud vznikne pro potřebu kupujícího překlad textu smlouvy, platí, že v případě sporu o výklad pojmů platí výklad smlouvy v českém jazyce.</w:t>
-      </w:r>
-    </w:p>
-    <w:p>
-      <w:pPr>
-        <w:numPr>
-          <w:ilvl w:val="0"/>
-          <w:numId w:val="15"/>
-        </w:numPr>
-      </w:pPr>
-      <w:r>
-        <w:t>Uzavřená kupní smlouva je prodávajícím archivována v interním systému po dobu nejméně tří let od jejího uzavření, nejdéle však na dobu dle příslušných právních předpisů, za účelem jejího úspěšného splnění a není přístupná třetím nezúčastněným stranám. Kupujícímu poskytne prodávající přístup ke kupní smlouvě v odůvodněných případech.</w:t>
-      </w:r>
-    </w:p>
-    <w:p>
-      <w:pPr>
-        <w:numPr>
-          <w:ilvl w:val="0"/>
-          <w:numId w:val="15"/>
-        </w:numPr>
-      </w:pPr>
-      <w:r>
-        <w:t>Je-li některé ustanovení těchto obchodních podmínek neplatné nebo neúčinné, nebo se takovým stane, namísto neplatných ustanovení nastoupí ustanovení, jehož smysl se neplatnému ustanovení co nejvíce přibližuje. Neplatností nebo neúčinností jednoho ustanovení není dotčena platnost ostatních ustanovení.</w:t>
+        <w:t>jehož smysl se neplatnému ustanovení co nejvíce přibližuje. Neplatností nebo neúčinností jednoho ustanovení není dotčena platnost ostatních ustanovení.</w:t>
       </w:r>
     </w:p>
     <w:p>

</xml_diff>